<commit_message>
Updated times - daylight saving is in effect
</commit_message>
<xml_diff>
--- a/assets/abstracts/Flyer_seminar85.docx
+++ b/assets/abstracts/Flyer_seminar85.docx
@@ -289,7 +289,7 @@
           <w:szCs w:val="22"/>
           <w:lang w:eastAsia="zh-CN"/>
         </w:rPr>
-        <w:t>S</w:t>
+        <w:t>D</w:t>
       </w:r>
       <w:r>
         <w:rPr>
@@ -321,6 +321,22 @@
           <w:szCs w:val="22"/>
           <w:lang w:eastAsia="zh-CN"/>
         </w:rPr>
+        <w:t>2</w:t>
+      </w:r>
+      <w:r>
+        <w:rPr>
+          <w:sz w:val="28"/>
+          <w:szCs w:val="22"/>
+          <w:lang w:eastAsia="zh-CN"/>
+        </w:rPr>
+        <w:t xml:space="preserve">:00 – </w:t>
+      </w:r>
+      <w:r>
+        <w:rPr>
+          <w:sz w:val="28"/>
+          <w:szCs w:val="22"/>
+          <w:lang w:eastAsia="zh-CN"/>
+        </w:rPr>
         <w:t>3</w:t>
       </w:r>
       <w:r>
@@ -329,7 +345,7 @@
           <w:szCs w:val="22"/>
           <w:lang w:eastAsia="zh-CN"/>
         </w:rPr>
-        <w:t xml:space="preserve">:00 – </w:t>
+        <w:t>:30</w:t>
       </w:r>
       <w:r>
         <w:rPr>
@@ -337,6 +353,78 @@
           <w:szCs w:val="22"/>
           <w:lang w:eastAsia="zh-CN"/>
         </w:rPr>
+        <w:t xml:space="preserve"> pm</w:t>
+      </w:r>
+      <w:r>
+        <w:rPr>
+          <w:sz w:val="28"/>
+          <w:szCs w:val="22"/>
+          <w:lang w:eastAsia="zh-CN"/>
+        </w:rPr>
+        <w:t xml:space="preserve"> </w:t>
+      </w:r>
+      <w:r>
+        <w:rPr>
+          <w:sz w:val="28"/>
+          <w:szCs w:val="22"/>
+          <w:lang w:eastAsia="zh-CN"/>
+        </w:rPr>
+        <w:t>GMT</w:t>
+      </w:r>
+      <w:r>
+        <w:rPr>
+          <w:sz w:val="28"/>
+          <w:szCs w:val="22"/>
+          <w:lang w:eastAsia="zh-CN"/>
+        </w:rPr>
+        <w:t xml:space="preserve"> London</w:t>
+      </w:r>
+      <w:r>
+        <w:rPr>
+          <w:sz w:val="28"/>
+          <w:szCs w:val="22"/>
+          <w:lang w:eastAsia="zh-CN"/>
+        </w:rPr>
+        <w:t xml:space="preserve"> / </w:t>
+      </w:r>
+      <w:r>
+        <w:rPr>
+          <w:sz w:val="28"/>
+          <w:szCs w:val="22"/>
+          <w:lang w:eastAsia="zh-CN"/>
+        </w:rPr>
+        <w:t>3</w:t>
+      </w:r>
+      <w:r>
+        <w:rPr>
+          <w:sz w:val="28"/>
+          <w:szCs w:val="22"/>
+          <w:lang w:eastAsia="zh-CN"/>
+        </w:rPr>
+        <w:t>:</w:t>
+      </w:r>
+      <w:r>
+        <w:rPr>
+          <w:sz w:val="28"/>
+          <w:szCs w:val="22"/>
+          <w:lang w:eastAsia="zh-CN"/>
+        </w:rPr>
+        <w:t>0</w:t>
+      </w:r>
+      <w:r>
+        <w:rPr>
+          <w:sz w:val="28"/>
+          <w:szCs w:val="22"/>
+          <w:lang w:eastAsia="zh-CN"/>
+        </w:rPr>
+        <w:t xml:space="preserve">0 pm – </w:t>
+      </w:r>
+      <w:r>
+        <w:rPr>
+          <w:sz w:val="28"/>
+          <w:szCs w:val="22"/>
+          <w:lang w:eastAsia="zh-CN"/>
+        </w:rPr>
         <w:t>4</w:t>
       </w:r>
       <w:r>
@@ -345,7 +433,7 @@
           <w:szCs w:val="22"/>
           <w:lang w:eastAsia="zh-CN"/>
         </w:rPr>
-        <w:t>:30</w:t>
+        <w:t>:3</w:t>
       </w:r>
       <w:r>
         <w:rPr>
@@ -353,6 +441,46 @@
           <w:szCs w:val="22"/>
           <w:lang w:eastAsia="zh-CN"/>
         </w:rPr>
+        <w:t xml:space="preserve">0 pm </w:t>
+      </w:r>
+      <w:r>
+        <w:rPr>
+          <w:sz w:val="28"/>
+          <w:szCs w:val="22"/>
+          <w:lang w:eastAsia="zh-CN"/>
+        </w:rPr>
+        <w:t xml:space="preserve">CET </w:t>
+      </w:r>
+      <w:r>
+        <w:rPr>
+          <w:sz w:val="28"/>
+          <w:szCs w:val="22"/>
+          <w:lang w:eastAsia="zh-CN"/>
+        </w:rPr>
+        <w:t xml:space="preserve">Paris </w:t>
+      </w:r>
+      <w:r>
+        <w:rPr>
+          <w:sz w:val="28"/>
+          <w:szCs w:val="22"/>
+          <w:lang w:eastAsia="zh-CN"/>
+        </w:rPr>
+        <w:t>/ 1</w:t>
+      </w:r>
+      <w:r>
+        <w:rPr>
+          <w:sz w:val="28"/>
+          <w:szCs w:val="22"/>
+          <w:lang w:eastAsia="zh-CN"/>
+        </w:rPr>
+        <w:t>0</w:t>
+      </w:r>
+      <w:r>
+        <w:rPr>
+          <w:sz w:val="28"/>
+          <w:szCs w:val="22"/>
+          <w:lang w:eastAsia="zh-CN"/>
+        </w:rPr>
         <w:t xml:space="preserve"> pm</w:t>
       </w:r>
       <w:r>
@@ -361,7 +489,7 @@
           <w:szCs w:val="22"/>
           <w:lang w:eastAsia="zh-CN"/>
         </w:rPr>
-        <w:t xml:space="preserve"> </w:t>
+        <w:t xml:space="preserve"> – 1</w:t>
       </w:r>
       <w:r>
         <w:rPr>
@@ -369,7 +497,7 @@
           <w:szCs w:val="22"/>
           <w:lang w:eastAsia="zh-CN"/>
         </w:rPr>
-        <w:t>GMT</w:t>
+        <w:t>1</w:t>
       </w:r>
       <w:r>
         <w:rPr>
@@ -377,7 +505,7 @@
           <w:szCs w:val="22"/>
           <w:lang w:eastAsia="zh-CN"/>
         </w:rPr>
-        <w:t xml:space="preserve"> London</w:t>
+        <w:t xml:space="preserve">:30 </w:t>
       </w:r>
       <w:r>
         <w:rPr>
@@ -385,135 +513,7 @@
           <w:szCs w:val="22"/>
           <w:lang w:eastAsia="zh-CN"/>
         </w:rPr>
-        <w:t xml:space="preserve"> / </w:t>
-      </w:r>
-      <w:r>
-        <w:rPr>
-          <w:sz w:val="28"/>
-          <w:szCs w:val="22"/>
-          <w:lang w:eastAsia="zh-CN"/>
-        </w:rPr>
-        <w:t>4</w:t>
-      </w:r>
-      <w:r>
-        <w:rPr>
-          <w:sz w:val="28"/>
-          <w:szCs w:val="22"/>
-          <w:lang w:eastAsia="zh-CN"/>
-        </w:rPr>
-        <w:t>:</w:t>
-      </w:r>
-      <w:r>
-        <w:rPr>
-          <w:sz w:val="28"/>
-          <w:szCs w:val="22"/>
-          <w:lang w:eastAsia="zh-CN"/>
-        </w:rPr>
-        <w:t>0</w:t>
-      </w:r>
-      <w:r>
-        <w:rPr>
-          <w:sz w:val="28"/>
-          <w:szCs w:val="22"/>
-          <w:lang w:eastAsia="zh-CN"/>
-        </w:rPr>
-        <w:t xml:space="preserve">0 pm – </w:t>
-      </w:r>
-      <w:r>
-        <w:rPr>
-          <w:sz w:val="28"/>
-          <w:szCs w:val="22"/>
-          <w:lang w:eastAsia="zh-CN"/>
-        </w:rPr>
-        <w:t>5</w:t>
-      </w:r>
-      <w:r>
-        <w:rPr>
-          <w:sz w:val="28"/>
-          <w:szCs w:val="22"/>
-          <w:lang w:eastAsia="zh-CN"/>
-        </w:rPr>
-        <w:t>:3</w:t>
-      </w:r>
-      <w:r>
-        <w:rPr>
-          <w:sz w:val="28"/>
-          <w:szCs w:val="22"/>
-          <w:lang w:eastAsia="zh-CN"/>
-        </w:rPr>
-        <w:t xml:space="preserve">0 pm </w:t>
-      </w:r>
-      <w:r>
-        <w:rPr>
-          <w:sz w:val="28"/>
-          <w:szCs w:val="22"/>
-          <w:lang w:eastAsia="zh-CN"/>
-        </w:rPr>
-        <w:t xml:space="preserve">CET </w:t>
-      </w:r>
-      <w:r>
-        <w:rPr>
-          <w:sz w:val="28"/>
-          <w:szCs w:val="22"/>
-          <w:lang w:eastAsia="zh-CN"/>
-        </w:rPr>
-        <w:t xml:space="preserve">Paris </w:t>
-      </w:r>
-      <w:r>
-        <w:rPr>
-          <w:sz w:val="28"/>
-          <w:szCs w:val="22"/>
-          <w:lang w:eastAsia="zh-CN"/>
-        </w:rPr>
-        <w:t>/ 1</w:t>
-      </w:r>
-      <w:r>
-        <w:rPr>
-          <w:sz w:val="28"/>
-          <w:szCs w:val="22"/>
-          <w:lang w:eastAsia="zh-CN"/>
-        </w:rPr>
-        <w:t>1</w:t>
-      </w:r>
-      <w:r>
-        <w:rPr>
-          <w:sz w:val="28"/>
-          <w:szCs w:val="22"/>
-          <w:lang w:eastAsia="zh-CN"/>
-        </w:rPr>
-        <w:t xml:space="preserve"> pm</w:t>
-      </w:r>
-      <w:r>
-        <w:rPr>
-          <w:sz w:val="28"/>
-          <w:szCs w:val="22"/>
-          <w:lang w:eastAsia="zh-CN"/>
-        </w:rPr>
-        <w:t xml:space="preserve"> – 1</w:t>
-      </w:r>
-      <w:r>
-        <w:rPr>
-          <w:sz w:val="28"/>
-          <w:szCs w:val="22"/>
-          <w:lang w:eastAsia="zh-CN"/>
-        </w:rPr>
-        <w:t>2</w:t>
-      </w:r>
-      <w:r>
-        <w:rPr>
-          <w:sz w:val="28"/>
-          <w:szCs w:val="22"/>
-          <w:lang w:eastAsia="zh-CN"/>
-        </w:rPr>
-        <w:t xml:space="preserve">:30 </w:t>
-      </w:r>
-      <w:r>
-        <w:rPr>
-          <w:sz w:val="28"/>
-          <w:szCs w:val="22"/>
-          <w:lang w:eastAsia="zh-CN"/>
-        </w:rPr>
-        <w:t>a</w:t>
+        <w:t>p</w:t>
       </w:r>
       <w:r>
         <w:rPr>
@@ -675,9 +675,8 @@
           <w:szCs w:val="28"/>
           <w:lang w:val="en-US"/>
         </w:rPr>
-        <w:t>………………………………………………………………………</w:t>
-      </w:r>
-      <w:proofErr w:type="gramStart"/>
+        <w:t>…………………………………………………………………………..</w:t>
+      </w:r>
       <w:r>
         <w:rPr>
           <w:rFonts w:ascii="Times New Roman" w:hAnsi="Times New Roman"/>
@@ -685,9 +684,8 @@
           <w:szCs w:val="28"/>
           <w:lang w:val="en-US"/>
         </w:rPr>
-        <w:t>…..</w:t>
-      </w:r>
-      <w:proofErr w:type="gramEnd"/>
+        <w:t>p</w:t>
+      </w:r>
       <w:r>
         <w:rPr>
           <w:rFonts w:ascii="Times New Roman" w:hAnsi="Times New Roman"/>
@@ -695,7 +693,7 @@
           <w:szCs w:val="28"/>
           <w:lang w:val="en-US"/>
         </w:rPr>
-        <w:t>p</w:t>
+        <w:t xml:space="preserve">age </w:t>
       </w:r>
       <w:r>
         <w:rPr>
@@ -704,15 +702,6 @@
           <w:szCs w:val="28"/>
           <w:lang w:val="en-US"/>
         </w:rPr>
-        <w:t xml:space="preserve">age </w:t>
-      </w:r>
-      <w:r>
-        <w:rPr>
-          <w:rFonts w:ascii="Times New Roman" w:hAnsi="Times New Roman"/>
-          <w:sz w:val="28"/>
-          <w:szCs w:val="28"/>
-          <w:lang w:val="en-US"/>
-        </w:rPr>
         <w:t>2</w:t>
       </w:r>
     </w:p>
@@ -814,7 +803,6 @@
         </w:rPr>
         <w:t>…</w:t>
       </w:r>
-      <w:proofErr w:type="gramStart"/>
       <w:r>
         <w:rPr>
           <w:rFonts w:ascii="Times New Roman" w:hAnsi="Times New Roman"/>
@@ -823,7 +811,6 @@
         </w:rPr>
         <w:t>…..</w:t>
       </w:r>
-      <w:proofErr w:type="gramEnd"/>
       <w:r>
         <w:rPr>
           <w:rFonts w:ascii="Times New Roman" w:hAnsi="Times New Roman"/>
@@ -883,7 +870,6 @@
         </w:rPr>
         <w:t>……</w:t>
       </w:r>
-      <w:proofErr w:type="gramStart"/>
       <w:r>
         <w:rPr>
           <w:rFonts w:ascii="Times New Roman" w:hAnsi="Times New Roman"/>
@@ -892,7 +878,6 @@
         </w:rPr>
         <w:t>…..</w:t>
       </w:r>
-      <w:proofErr w:type="gramEnd"/>
       <w:r>
         <w:rPr>
           <w:rFonts w:ascii="Times New Roman" w:hAnsi="Times New Roman"/>
@@ -1330,25 +1315,7 @@
           <w:sz w:val="24"/>
           <w:szCs w:val="24"/>
         </w:rPr>
-        <w:t xml:space="preserve"> beads has been exploited extensively for calculating statistical and dynamical properties subject to NQEs. Here, I will discuss our recent method and software developments in the context of the ring polymer surface hopping (RPSH) methodology where the non-adiabatic electronic transitions are described through Tully’s fewest-switches surface hopping algorithm and the motion of the nuclei is </w:t>
-      </w:r>
-      <w:proofErr w:type="gramStart"/>
-      <w:r>
-        <w:rPr>
-          <w:rFonts w:ascii="Times New Roman" w:hAnsi="Times New Roman"/>
-          <w:sz w:val="24"/>
-          <w:szCs w:val="24"/>
-        </w:rPr>
-        <w:t>quantized</w:t>
-      </w:r>
-      <w:proofErr w:type="gramEnd"/>
-      <w:r>
-        <w:rPr>
-          <w:rFonts w:ascii="Times New Roman" w:hAnsi="Times New Roman"/>
-          <w:sz w:val="24"/>
-          <w:szCs w:val="24"/>
-        </w:rPr>
-        <w:t xml:space="preserve"> through the ring polymer Hamiltonian in the extended phase space. </w:t>
+        <w:t xml:space="preserve"> beads has been exploited extensively for calculating statistical and dynamical properties subject to NQEs. Here, I will discuss our recent method and software developments in the context of the ring polymer surface hopping (RPSH) methodology where the non-adiabatic electronic transitions are described through Tully’s fewest-switches surface hopping algorithm and the motion of the nuclei is quantized through the ring polymer Hamiltonian in the extended phase space. </w:t>
       </w:r>
       <w:r>
         <w:rPr>
@@ -1522,25 +1489,7 @@
           <w:iCs/>
           <w:color w:val="0E101A"/>
         </w:rPr>
-        <w:t xml:space="preserve">Simons </w:t>
-      </w:r>
-      <w:proofErr w:type="spellStart"/>
-      <w:r>
-        <w:rPr>
-          <w:i/>
-          <w:iCs/>
-          <w:color w:val="0E101A"/>
-        </w:rPr>
-        <w:t>Center</w:t>
-      </w:r>
-      <w:proofErr w:type="spellEnd"/>
-      <w:r>
-        <w:rPr>
-          <w:i/>
-          <w:iCs/>
-          <w:color w:val="0E101A"/>
-        </w:rPr>
-        <w:t xml:space="preserve"> for Computational Physical Chemistry, New York University, New York, NY 10003, USA</w:t>
+        <w:t>Simons Center for Computational Physical Chemistry, New York University, New York, NY 10003, USA</w:t>
       </w:r>
     </w:p>
     <w:p>
@@ -1763,21 +1712,7 @@
         <w:rPr>
           <w:color w:val="0E101A"/>
         </w:rPr>
-        <w:t xml:space="preserve">). Our results reveal that collective relaxation achieves maximum modification at an optimal coupling strength, highlighting an intriguing phenomenon where vibrational polaritons can mediate collective relaxation dynamics at much longer timescales. I conclude this talk with future directions on </w:t>
-      </w:r>
-      <w:proofErr w:type="spellStart"/>
-      <w:r>
-        <w:rPr>
-          <w:color w:val="0E101A"/>
-        </w:rPr>
-        <w:t>modeling</w:t>
-      </w:r>
-      <w:proofErr w:type="spellEnd"/>
-      <w:r>
-        <w:rPr>
-          <w:color w:val="0E101A"/>
-        </w:rPr>
-        <w:t xml:space="preserve"> collective phenomena in vibrational polaritonic chemistry.</w:t>
+        <w:t>). Our results reveal that collective relaxation achieves maximum modification at an optimal coupling strength, highlighting an intriguing phenomenon where vibrational polaritons can mediate collective relaxation dynamics at much longer timescales. I conclude this talk with future directions on modeling collective phenomena in vibrational polaritonic chemistry.</w:t>
       </w:r>
     </w:p>
     <w:p>
@@ -1997,25 +1932,7 @@
           <w:sz w:val="24"/>
           <w:szCs w:val="24"/>
         </w:rPr>
-        <w:t xml:space="preserve">Time: Mar 12, </w:t>
-      </w:r>
-      <w:proofErr w:type="gramStart"/>
-      <w:r>
-        <w:rPr>
-          <w:rFonts w:asciiTheme="minorHAnsi" w:hAnsiTheme="minorHAnsi" w:cstheme="minorHAnsi"/>
-          <w:sz w:val="24"/>
-          <w:szCs w:val="24"/>
-        </w:rPr>
-        <w:t>2025</w:t>
-      </w:r>
-      <w:proofErr w:type="gramEnd"/>
-      <w:r>
-        <w:rPr>
-          <w:rFonts w:asciiTheme="minorHAnsi" w:hAnsiTheme="minorHAnsi" w:cstheme="minorHAnsi"/>
-          <w:sz w:val="24"/>
-          <w:szCs w:val="24"/>
-        </w:rPr>
-        <w:t xml:space="preserve"> 10:00 AM Eastern Time (US and Canada)</w:t>
+        <w:t>Time: Mar 12, 2025 10:00 AM Eastern Time (US and Canada)</w:t>
       </w:r>
     </w:p>
     <w:p>

</xml_diff>